<commit_message>
Actualización completa: estrellas animadas, botones Drive, tipografía Acumin BOLD, footer, CV.md, contacto actualizado
</commit_message>
<xml_diff>
--- a/Arquitectura-CV.docx
+++ b/Arquitectura-CV.docx
@@ -2636,7 +2636,33 @@
           <w:sz w:val="22"/>
           <w:szCs w:val="22"/>
         </w:rPr>
-        <w:t xml:space="preserve"> con un buen café de olla-</w:t>
+        <w:t xml:space="preserve"> con un buen café de olla</w:t>
+      </w:r>
+      <w:r>
+        <w:rPr>
+          <w:rFonts w:ascii="Arial" w:hAnsi="Arial" w:cs="Arial"/>
+          <w:sz w:val="22"/>
+          <w:szCs w:val="22"/>
+        </w:rPr>
+        <w:t xml:space="preserve"> </w:t>
+      </w:r>
+      <w:r>
+        <w:rPr>
+          <w:rFonts w:ascii="Segoe UI" w:hAnsi="Segoe UI" w:cs="Segoe UI"/>
+          <w:color w:val="161616"/>
+          <w:sz w:val="21"/>
+          <w:szCs w:val="21"/>
+          <w:shd w:val="clear" w:color="auto" w:fill="FFFFFF"/>
+        </w:rPr>
+        <w:t xml:space="preserve">y </w:t>
+      </w:r>
+      <w:r>
+        <w:rPr>
+          <w:rFonts w:ascii="Arial" w:hAnsi="Arial" w:cs="Arial"/>
+          <w:sz w:val="22"/>
+          <w:szCs w:val="22"/>
+        </w:rPr>
+        <w:t>una pizca de curiosidad</w:t>
       </w:r>
     </w:p>
     <w:p>

</xml_diff>